<commit_message>
se agraga imagen de procesos funcionales y se actualizan siertos errores del trabajo de boar
</commit_message>
<xml_diff>
--- a/Modelacion de procesos (Maria Rios)/Tabla actualizada.docx
+++ b/Modelacion de procesos (Maria Rios)/Tabla actualizada.docx
@@ -399,7 +399,25 @@
                 <w:sz w:val="24"/>
                 <w:szCs w:val="24"/>
               </w:rPr>
-              <w:t>Ingresar datos(nombre</w:t>
+              <w:t xml:space="preserve">Ingresar </w:t>
+            </w:r>
+            <w:proofErr w:type="gramStart"/>
+            <w:r>
+              <w:rPr>
+                <w:rFonts w:ascii="Trebuchet MS" w:hAnsi="Trebuchet MS"/>
+                <w:sz w:val="24"/>
+                <w:szCs w:val="24"/>
+              </w:rPr>
+              <w:t>datos(</w:t>
+            </w:r>
+            <w:proofErr w:type="gramEnd"/>
+            <w:r>
+              <w:rPr>
+                <w:rFonts w:ascii="Trebuchet MS" w:hAnsi="Trebuchet MS"/>
+                <w:sz w:val="24"/>
+                <w:szCs w:val="24"/>
+              </w:rPr>
+              <w:t>nombre</w:t>
             </w:r>
             <w:r>
               <w:rPr>
@@ -787,7 +805,25 @@
                 <w:sz w:val="24"/>
                 <w:szCs w:val="24"/>
               </w:rPr>
-              <w:t>Acceso al información del bibliotecario</w:t>
+              <w:t xml:space="preserve">Acceso </w:t>
+            </w:r>
+            <w:proofErr w:type="gramStart"/>
+            <w:r>
+              <w:rPr>
+                <w:rFonts w:ascii="Trebuchet MS" w:hAnsi="Trebuchet MS"/>
+                <w:sz w:val="24"/>
+                <w:szCs w:val="24"/>
+              </w:rPr>
+              <w:t>al información</w:t>
+            </w:r>
+            <w:proofErr w:type="gramEnd"/>
+            <w:r>
+              <w:rPr>
+                <w:rFonts w:ascii="Trebuchet MS" w:hAnsi="Trebuchet MS"/>
+                <w:sz w:val="24"/>
+                <w:szCs w:val="24"/>
+              </w:rPr>
+              <w:t xml:space="preserve"> del bibliotecario</w:t>
             </w:r>
           </w:p>
         </w:tc>
@@ -1312,7 +1348,25 @@
                 <w:sz w:val="24"/>
                 <w:szCs w:val="24"/>
               </w:rPr>
-              <w:t>mplementar login con usuario y contraseña</w:t>
+              <w:t xml:space="preserve">mplementar </w:t>
+            </w:r>
+            <w:proofErr w:type="spellStart"/>
+            <w:r>
+              <w:rPr>
+                <w:rFonts w:ascii="Trebuchet MS" w:hAnsi="Trebuchet MS"/>
+                <w:sz w:val="24"/>
+                <w:szCs w:val="24"/>
+              </w:rPr>
+              <w:t>login</w:t>
+            </w:r>
+            <w:proofErr w:type="spellEnd"/>
+            <w:r>
+              <w:rPr>
+                <w:rFonts w:ascii="Trebuchet MS" w:hAnsi="Trebuchet MS"/>
+                <w:sz w:val="24"/>
+                <w:szCs w:val="24"/>
+              </w:rPr>
+              <w:t xml:space="preserve"> con usuario y contraseña</w:t>
             </w:r>
           </w:p>
         </w:tc>
@@ -1388,7 +1442,25 @@
                 <w:sz w:val="24"/>
                 <w:szCs w:val="24"/>
               </w:rPr>
-              <w:t>un bibliotecario si nay algo pendiente.</w:t>
+              <w:t xml:space="preserve">un bibliotecario si </w:t>
+            </w:r>
+            <w:proofErr w:type="spellStart"/>
+            <w:r>
+              <w:rPr>
+                <w:rFonts w:ascii="Trebuchet MS" w:hAnsi="Trebuchet MS"/>
+                <w:sz w:val="24"/>
+                <w:szCs w:val="24"/>
+              </w:rPr>
+              <w:t>nay</w:t>
+            </w:r>
+            <w:proofErr w:type="spellEnd"/>
+            <w:r>
+              <w:rPr>
+                <w:rFonts w:ascii="Trebuchet MS" w:hAnsi="Trebuchet MS"/>
+                <w:sz w:val="24"/>
+                <w:szCs w:val="24"/>
+              </w:rPr>
+              <w:t xml:space="preserve"> algo pendiente.</w:t>
             </w:r>
           </w:p>
         </w:tc>

</xml_diff>